<commit_message>
Rewrite index guiding notes as flowing prose
Co-Authored-By: Claude Fable 5 <noreply@anthropic.com>
Claude-Session: https://claude.ai/code/session_01WLCoJ9gmuQFp7YFhChmBui
</commit_message>
<xml_diff>
--- a/former-teachers-paper-index.docx
+++ b/former-teachers-paper-index.docx
@@ -31,7 +31,7 @@
           <w:sz w:val="22"/>
           <w:szCs w:val="22"/>
         </w:rPr>
-        <w:t xml:space="preserve">Los teacher shortages existen, son cuantificables y su magnitud los vuelve especialmente relevantes en muchas partes del mundo; además, las aulas son cada vez más diversas y la formación docente suele quedarse atrás. Una respuesta a estos retos es re-atraer a quienes dejaron la profesión —hacia otro empleo o fuera del mercado laboral— y a los jubilados, no necesariamente al aula: también como mentores que aporten su experiencia a los docentes más jóvenes (diseño curricular, manejo del aula). El paper ofrece a los policymakers evidencia internacional sobre por qué se van los profesores y qué se ha hecho para re-atraerlos. Cada capítulo parte de una premisa: la respuesta depende del contexto.</w:t>
+        <w:t xml:space="preserve">Los teacher shortages existen, son cuantificables y su magnitud los vuelve especialmente relevantes en muchas partes del mundo. Las aulas son además cada vez más diversas y la formación docente suele quedarse atrás. Una respuesta a estos retos es re-atraer a quienes dejaron la profesión —hacia otro empleo o fuera del mercado laboral— y a los jubilados, no necesariamente al aula sino también como mentores que aporten su experiencia a los docentes más jóvenes, por ejemplo en el diseño curricular o el manejo del aula. El paper ofrece a los policymakers evidencia internacional sobre por qué se van los profesores y qué se ha hecho para re-atraerlos, y cada capítulo parte de la premisa de que la respuesta depende del contexto.</w:t>
       </w:r>
     </w:p>
     <w:p>
@@ -79,7 +79,7 @@
           <w:sz w:val="22"/>
           <w:szCs w:val="22"/>
         </w:rPr>
-        <w:t xml:space="preserve">El problema: shortages medibles y de magnitud relevante; aulas más diversas y formación que llega tarde. La respuesta que exploramos: re-atraer a leavers y jubilados, al aula o como mentores. Qué aporta el paper y a quién.</w:t>
+        <w:t xml:space="preserve">Los shortages son medibles y de magnitud relevante, las aulas son cada vez más diversas y la formación docente llega tarde. Este paper explora como respuesta el re-atraer a leavers y jubilados, al aula o como mentores. Qué aporta y a quién.</w:t>
       </w:r>
     </w:p>
     <w:p>
@@ -112,7 +112,7 @@
           <w:sz w:val="22"/>
           <w:szCs w:val="22"/>
         </w:rPr>
-        <w:t xml:space="preserve">Depende del contexto: el peso de los motivos intrínsecos y extrínsecos varía entre países (p. ej., EE.UU. frente a otros sistemas). Quién se va, por qué, a dónde van, y qué reserva de docentes cualificados representan.</w:t>
+        <w:t xml:space="preserve">El peso de los motivos intrínsecos y extrínsecos varía según el contexto, como muestra el contraste entre EE.UU. y otros sistemas. Quién se va, por qué lo hace, a dónde va y qué reserva de docentes cualificados representa.</w:t>
       </w:r>
     </w:p>
     <w:p>
@@ -145,7 +145,7 @@
           <w:sz w:val="22"/>
           <w:szCs w:val="22"/>
         </w:rPr>
-        <w:t xml:space="preserve">Depende del contexto: lo que haría volver a un leaver no es lo que re-engancha a un jubilado. Incentivos económicos y no económicos, con presupuesto limitado; qué muestra la evidencia disponible.</w:t>
+        <w:t xml:space="preserve">Lo que haría volver a un leaver no es lo mismo que re-engancha a un jubilado, y también aquí manda el contexto. Incentivos económicos y no económicos con presupuesto limitado, y qué muestra la evidencia disponible.</w:t>
       </w:r>
     </w:p>
     <w:p>
@@ -178,7 +178,7 @@
           <w:sz w:val="22"/>
           <w:szCs w:val="22"/>
         </w:rPr>
-        <w:t xml:space="preserve">Depende del contexto: cada sistema combina programas y regulación según su punto de partida. Casos seleccionados de nuestro Excel.</w:t>
+        <w:t xml:space="preserve">Cada sistema combina programas y regulación según su punto de partida. Casos seleccionados de nuestro Excel.</w:t>
       </w:r>
     </w:p>
     <w:p>
@@ -279,7 +279,7 @@
           <w:sz w:val="22"/>
           <w:szCs w:val="22"/>
         </w:rPr>
-        <w:t xml:space="preserve">Depende del contexto, pero hay patrones: qué detalles de diseño determinan el uptake, qué evidencia falta y cómo construirla. Recomendaciones.</w:t>
+        <w:t xml:space="preserve">El contexto también condiciona las lecciones, pero hay patrones sobre qué detalles de diseño determinan el uptake, qué evidencia falta y cómo construirla. Recomendaciones para policymakers.</w:t>
       </w:r>
     </w:p>
     <w:p>

</xml_diff>

<commit_message>
Context is a caveat, not the thesis: record editorial stance and fix index wording
Co-Authored-By: Claude Fable 5 <noreply@anthropic.com>
Claude-Session: https://claude.ai/code/session_01WLCoJ9gmuQFp7YFhChmBui
</commit_message>
<xml_diff>
--- a/former-teachers-paper-index.docx
+++ b/former-teachers-paper-index.docx
@@ -31,7 +31,7 @@
           <w:sz w:val="22"/>
           <w:szCs w:val="22"/>
         </w:rPr>
-        <w:t xml:space="preserve">Los teacher shortages existen, son cuantificables y su magnitud los vuelve especialmente relevantes en muchas partes del mundo. Las aulas son además cada vez más diversas y la formación docente suele quedarse atrás. Una respuesta a estos retos es re-atraer a quienes dejaron la profesión —hacia otro empleo o fuera del mercado laboral— y a los jubilados, no necesariamente al aula sino también como mentores que aporten su experiencia a los docentes más jóvenes, por ejemplo en el diseño curricular o el manejo del aula. El paper ofrece a los policymakers evidencia internacional sobre por qué se van los profesores y qué se ha hecho para re-atraerlos, y cada capítulo parte de la premisa de que la respuesta depende del contexto.</w:t>
+        <w:t xml:space="preserve">Los teacher shortages existen, son cuantificables y su magnitud los vuelve especialmente relevantes en muchas partes del mundo. Las aulas son además cada vez más diversas y la formación docente suele quedarse atrás. Una respuesta a estos retos es re-atraer a quienes dejaron la profesión —hacia otro empleo o fuera del mercado laboral— y a los jubilados, no necesariamente al aula sino también como mentores que aporten su experiencia a los docentes más jóvenes, por ejemplo en el diseño curricular o el manejo del aula. El paper ofrece a los policymakers evidencia internacional sobre por qué se van los profesores y qué se ha hecho para re-atraerlos, generalizando donde la evidencia lo permite y matizando por contexto donde no.</w:t>
       </w:r>
     </w:p>
     <w:p>
@@ -145,7 +145,7 @@
           <w:sz w:val="22"/>
           <w:szCs w:val="22"/>
         </w:rPr>
-        <w:t xml:space="preserve">Lo que haría volver a un leaver no es lo mismo que re-engancha a un jubilado, y también aquí manda el contexto. Incentivos económicos y no económicos con presupuesto limitado, y qué muestra la evidencia disponible.</w:t>
+        <w:t xml:space="preserve">Lo que haría volver a un leaver no es lo mismo que re-engancha a un jubilado. Incentivos económicos y no económicos con presupuesto limitado, y qué muestra la evidencia disponible.</w:t>
       </w:r>
     </w:p>
     <w:p>
@@ -279,7 +279,7 @@
           <w:sz w:val="22"/>
           <w:szCs w:val="22"/>
         </w:rPr>
-        <w:t xml:space="preserve">El contexto también condiciona las lecciones, pero hay patrones sobre qué detalles de diseño determinan el uptake, qué evidencia falta y cómo construirla. Recomendaciones para policymakers.</w:t>
+        <w:t xml:space="preserve">Hay patrones claros sobre qué detalles de diseño determinan el uptake, qué evidencia falta y cómo construirla. Recomendaciones para policymakers, con las cautelas de contexto que correspondan.</w:t>
       </w:r>
     </w:p>
     <w:p>

</xml_diff>